<commit_message>
ACP 0900193-90: v9 — petição de cadastro reescrita sem expor a cadeia de representação; instruída com cópias da procuração e do contrato social
Co-Authored-By: Claude Fable 5.1 <noreply@anthropic.com>
Claude-Session: https://claude.ai/code/session_01CCVbA1mc4UdnaFNsukuTYT
</commit_message>
<xml_diff>
--- a/juridico/ACP-0900193-90.2016.8.24.0064/2026-09-02-cumprimento-ev25/auditoria/RELATORIO-AUDITORIA.docx
+++ b/juridico/ACP-0900193-90.2016.8.24.0064/2026-09-02-cumprimento-ev25/auditoria/RELATORIO-AUDITORIA.docx
@@ -3961,7 +3961,7 @@
                 <w:sz w:val="20"/>
                 <w:szCs w:val="20"/>
               </w:rPr>
-              <w:t xml:space="preserve">refere os Docs. 2 e 3</w:t>
+              <w:t xml:space="preserve">Doc. 1 procuração e Doc. 2 contrato social (cópias)</w:t>
             </w:r>
           </w:p>
         </w:tc>
@@ -3993,7 +3993,7 @@
                 <w:sz w:val="20"/>
                 <w:szCs w:val="20"/>
               </w:rPr>
-              <w:t xml:space="preserve">sem prazo (mesmo dia, de preferência)</w:t>
+              <w:t xml:space="preserve">sem prazo (mesmo dia, logo depois da peça 1)</w:t>
             </w:r>
           </w:p>
         </w:tc>
@@ -13444,7 +13444,7 @@
           <w:sz w:val="24"/>
           <w:szCs w:val="24"/>
         </w:rPr>
-        <w:t xml:space="preserve">Peça 03: retirado o pedido de certidão das comunicações às renunciantes (preclusão provável e exposição desnecessária do intervalo sem procurador); mantidos baixa, intimação exclusiva (inclusive pauta) e razão social.</w:t>
+        <w:t xml:space="preserve">Peça 03: retirado o pedido de certidão das comunicações às renunciantes (preclusão provável e exposição desnecessária do intervalo sem procurador); retirados também a menção aos requerimentos de 2018/2019 (feitos sob mandato depois revogado), o contraste com a revogação (CPC 111), a cronologia dos atos do subscritor e a remissão ao art. 106, I (rege a causa própria); a petição passa a ser instruída com cópias da procuração e do contrato social, para anotação imediata pelo cadastro. Mantidos baixa, intimação exclusiva (inclusive pauta) e razão social.</w:t>
       </w:r>
     </w:p>
     <w:sectPr>

</xml_diff>

<commit_message>
ACP 0900193-90: relatório com a descrição do método de verificação; README dos laudos
Co-Authored-By: Claude Fable 5.1 <noreply@anthropic.com>
Claude-Session: https://claude.ai/code/session_01CCVbA1mc4UdnaFNsukuTYT
</commit_message>
<xml_diff>
--- a/juridico/ACP-0900193-90.2016.8.24.0064/2026-09-02-cumprimento-ev25/auditoria/RELATORIO-AUDITORIA.docx
+++ b/juridico/ACP-0900193-90.2016.8.24.0064/2026-09-02-cumprimento-ev25/auditoria/RELATORIO-AUDITORIA.docx
@@ -7048,6 +7048,25 @@
           <w:szCs w:val="24"/>
         </w:rPr>
         <w:t xml:space="preserve">E-mails de 02/09/2026 entre o advogado e a Seção de Custas Judiciais do TJSC (dcdp.custas@tjsc.jus.br); notas do escritório (pareceres de 16/08, 27/08, 28/08, 31/08 e 02/09/2026; árvore do 2º grau lida na tela do eproc em 31/08/2026); contrarrazões do MP (Ev. 284); checklist de protocolo da apelação (05/2026); textos da Súmula 51/TJSC, da Resolução CM n. 3/2019 e da Circular CGJ n. 643/2025 confirmados por busca na web.</w:t>
+      </w:r>
+    </w:p>
+    <w:p>
+      <w:pPr>
+        <w:pStyle w:val="ListParagraph"/>
+        <w:numPr>
+          <w:ilvl w:val="0"/>
+          <w:numId w:val="2"/>
+        </w:numPr>
+        <w:spacing w:after="80" w:line="360"/>
+        <w:jc w:val="both"/>
+      </w:pPr>
+      <w:r>
+        <w:rPr>
+          <w:rFonts w:ascii="Times New Roman" w:cs="Times New Roman" w:eastAsia="Times New Roman" w:hAnsi="Times New Roman"/>
+          <w:sz w:val="24"/>
+          <w:szCs w:val="24"/>
+        </w:rPr>
+        <w:t xml:space="preserve">Método: dossiê de fatos com coordenadas; quatro laudos de agentes independentes (preparo/deserção, representação processual, caminho processual, citações legais); nove revisões adversariais das três peças, em três lentes (fatos e citações; estratégia e risco; forma e norma culta), aplicadas em dez versões sucessivas; todos os laudos estão em `fontes/laudos/`.</w:t>
       </w:r>
     </w:p>
     <w:p>

</xml_diff>